<commit_message>
Cleaned up project files and documentation
</commit_message>
<xml_diff>
--- a/Project Documentation.docx
+++ b/Project Documentation.docx
@@ -761,47 +761,7 @@
           <w:szCs w:val="20"/>
           <w:lang w:eastAsia="zh-CN"/>
         </w:rPr>
-        <w:t xml:space="preserve">Disposal </w:t>
-      </w:r>
-      <w:r>
-        <w:rPr>
-          <w:rFonts w:ascii="Arial" w:eastAsia="Times New Roman" w:hAnsi="Arial" w:cs="Arial"/>
-          <w:color w:val="000000"/>
-          <w:sz w:val="20"/>
-          <w:szCs w:val="20"/>
-          <w:lang w:eastAsia="zh-CN"/>
-        </w:rPr>
-        <w:t>–</w:t>
-      </w:r>
-      <w:r>
-        <w:rPr>
-          <w:rFonts w:ascii="Arial" w:eastAsia="Times New Roman" w:hAnsi="Arial" w:cs="Arial"/>
-          <w:color w:val="000000"/>
-          <w:sz w:val="20"/>
-          <w:szCs w:val="20"/>
-          <w:lang w:eastAsia="zh-CN"/>
-        </w:rPr>
-        <w:t xml:space="preserve"> </w:t>
-      </w:r>
-      <w:r>
-        <w:rPr>
-          <w:rFonts w:ascii="Arial" w:eastAsia="Times New Roman" w:hAnsi="Arial" w:cs="Arial"/>
-          <w:color w:val="000000"/>
-          <w:sz w:val="20"/>
-          <w:szCs w:val="20"/>
-          <w:lang w:eastAsia="zh-CN"/>
-        </w:rPr>
-        <w:t>Landfill and other</w:t>
-      </w:r>
-      <w:r>
-        <w:rPr>
-          <w:rFonts w:ascii="Arial" w:eastAsia="Times New Roman" w:hAnsi="Arial" w:cs="Arial"/>
-          <w:color w:val="000000"/>
-          <w:sz w:val="20"/>
-          <w:szCs w:val="20"/>
-          <w:lang w:eastAsia="zh-CN"/>
-        </w:rPr>
-        <w:t xml:space="preserve"> (kg per capita)</w:t>
+        <w:t>Disposal – Landfill and other (kg per capita)</w:t>
       </w:r>
       <w:r>
         <w:rPr>
@@ -831,17 +791,7 @@
           <w:szCs w:val="20"/>
           <w:lang w:eastAsia="zh-CN"/>
         </w:rPr>
-        <w:t xml:space="preserve">nderstanding the quantity of waste </w:t>
-      </w:r>
-      <w:r>
-        <w:rPr>
-          <w:rFonts w:ascii="Arial" w:eastAsia="Times New Roman" w:hAnsi="Arial" w:cs="Arial"/>
-          <w:color w:val="000000"/>
-          <w:sz w:val="20"/>
-          <w:szCs w:val="20"/>
-          <w:lang w:eastAsia="zh-CN"/>
-        </w:rPr>
-        <w:t>not responsibly disposed of</w:t>
+        <w:t>nderstanding the quantity of waste not responsibly disposed of</w:t>
       </w:r>
     </w:p>
     <w:p>
@@ -1350,6 +1300,15 @@
               </w:rPr>
               <w:t>Title:</w:t>
             </w:r>
+            <w:r>
+              <w:rPr>
+                <w:rFonts w:ascii="Arial" w:eastAsia="Times New Roman" w:hAnsi="Arial" w:cs="Arial"/>
+                <w:color w:val="000000"/>
+                <w:sz w:val="20"/>
+                <w:lang w:eastAsia="zh-CN"/>
+              </w:rPr>
+              <w:t xml:space="preserve"> </w:t>
+            </w:r>
           </w:p>
         </w:tc>
         <w:tc>
@@ -1375,13 +1334,40 @@
             <w:r>
               <w:rPr>
                 <w:rFonts w:ascii="Arial" w:eastAsia="Times New Roman" w:hAnsi="Arial" w:cs="Arial"/>
-                <w:i/>
-                <w:iCs/>
-                <w:color w:val="000000"/>
-                <w:sz w:val="20"/>
-                <w:lang w:eastAsia="zh-CN"/>
-              </w:rPr>
-              <w:t>Test case Title</w:t>
+                <w:color w:val="000000"/>
+                <w:sz w:val="20"/>
+                <w:lang w:eastAsia="zh-CN"/>
+              </w:rPr>
+              <w:t>Initializing the app and r</w:t>
+            </w:r>
+            <w:r>
+              <w:rPr>
+                <w:rFonts w:ascii="Arial" w:eastAsia="Times New Roman" w:hAnsi="Arial" w:cs="Arial"/>
+                <w:color w:val="000000"/>
+                <w:sz w:val="20"/>
+                <w:lang w:eastAsia="zh-CN"/>
+              </w:rPr>
+              <w:t xml:space="preserve">unning </w:t>
+            </w:r>
+            <w:proofErr w:type="spellStart"/>
+            <w:r>
+              <w:rPr>
+                <w:rFonts w:ascii="Arial" w:eastAsia="Times New Roman" w:hAnsi="Arial" w:cs="Arial"/>
+                <w:color w:val="000000"/>
+                <w:sz w:val="20"/>
+                <w:lang w:eastAsia="zh-CN"/>
+              </w:rPr>
+              <w:t>Streamlit</w:t>
+            </w:r>
+            <w:proofErr w:type="spellEnd"/>
+            <w:r>
+              <w:rPr>
+                <w:rFonts w:ascii="Arial" w:eastAsia="Times New Roman" w:hAnsi="Arial" w:cs="Arial"/>
+                <w:color w:val="000000"/>
+                <w:sz w:val="20"/>
+                <w:lang w:eastAsia="zh-CN"/>
+              </w:rPr>
+              <w:t xml:space="preserve"> with a simple chart</w:t>
             </w:r>
           </w:p>
         </w:tc>
@@ -1496,17 +1482,6 @@
                 <w:lang w:eastAsia="zh-CN"/>
               </w:rPr>
             </w:pPr>
-            <w:r>
-              <w:rPr>
-                <w:rFonts w:ascii="Arial" w:eastAsia="Times New Roman" w:hAnsi="Arial" w:cs="Arial"/>
-                <w:i/>
-                <w:iCs/>
-                <w:color w:val="000000"/>
-                <w:sz w:val="20"/>
-                <w:lang w:eastAsia="zh-CN"/>
-              </w:rPr>
-              <w:t>Lorem Ipsum…</w:t>
-            </w:r>
           </w:p>
         </w:tc>
       </w:tr>

</xml_diff>

<commit_message>
Fixing visualization and sidebar function imports and adding reload logic for development
</commit_message>
<xml_diff>
--- a/Project Documentation.docx
+++ b/Project Documentation.docx
@@ -761,47 +761,7 @@
           <w:szCs w:val="20"/>
           <w:lang w:eastAsia="zh-CN"/>
         </w:rPr>
-        <w:t xml:space="preserve">Disposal </w:t>
-      </w:r>
-      <w:r>
-        <w:rPr>
-          <w:rFonts w:ascii="Arial" w:eastAsia="Times New Roman" w:hAnsi="Arial" w:cs="Arial"/>
-          <w:color w:val="000000"/>
-          <w:sz w:val="20"/>
-          <w:szCs w:val="20"/>
-          <w:lang w:eastAsia="zh-CN"/>
-        </w:rPr>
-        <w:t>–</w:t>
-      </w:r>
-      <w:r>
-        <w:rPr>
-          <w:rFonts w:ascii="Arial" w:eastAsia="Times New Roman" w:hAnsi="Arial" w:cs="Arial"/>
-          <w:color w:val="000000"/>
-          <w:sz w:val="20"/>
-          <w:szCs w:val="20"/>
-          <w:lang w:eastAsia="zh-CN"/>
-        </w:rPr>
-        <w:t xml:space="preserve"> </w:t>
-      </w:r>
-      <w:r>
-        <w:rPr>
-          <w:rFonts w:ascii="Arial" w:eastAsia="Times New Roman" w:hAnsi="Arial" w:cs="Arial"/>
-          <w:color w:val="000000"/>
-          <w:sz w:val="20"/>
-          <w:szCs w:val="20"/>
-          <w:lang w:eastAsia="zh-CN"/>
-        </w:rPr>
-        <w:t>Landfill and other</w:t>
-      </w:r>
-      <w:r>
-        <w:rPr>
-          <w:rFonts w:ascii="Arial" w:eastAsia="Times New Roman" w:hAnsi="Arial" w:cs="Arial"/>
-          <w:color w:val="000000"/>
-          <w:sz w:val="20"/>
-          <w:szCs w:val="20"/>
-          <w:lang w:eastAsia="zh-CN"/>
-        </w:rPr>
-        <w:t xml:space="preserve"> (kg per capita)</w:t>
+        <w:t>Disposal – Landfill and other (kg per capita)</w:t>
       </w:r>
       <w:r>
         <w:rPr>
@@ -831,17 +791,7 @@
           <w:szCs w:val="20"/>
           <w:lang w:eastAsia="zh-CN"/>
         </w:rPr>
-        <w:t xml:space="preserve">nderstanding the quantity of waste </w:t>
-      </w:r>
-      <w:r>
-        <w:rPr>
-          <w:rFonts w:ascii="Arial" w:eastAsia="Times New Roman" w:hAnsi="Arial" w:cs="Arial"/>
-          <w:color w:val="000000"/>
-          <w:sz w:val="20"/>
-          <w:szCs w:val="20"/>
-          <w:lang w:eastAsia="zh-CN"/>
-        </w:rPr>
-        <w:t>not responsibly disposed of</w:t>
+        <w:t>nderstanding the quantity of waste not responsibly disposed of</w:t>
       </w:r>
     </w:p>
     <w:p>
@@ -1350,6 +1300,15 @@
               </w:rPr>
               <w:t>Title:</w:t>
             </w:r>
+            <w:r>
+              <w:rPr>
+                <w:rFonts w:ascii="Arial" w:eastAsia="Times New Roman" w:hAnsi="Arial" w:cs="Arial"/>
+                <w:color w:val="000000"/>
+                <w:sz w:val="20"/>
+                <w:lang w:eastAsia="zh-CN"/>
+              </w:rPr>
+              <w:t xml:space="preserve"> </w:t>
+            </w:r>
           </w:p>
         </w:tc>
         <w:tc>
@@ -1375,13 +1334,40 @@
             <w:r>
               <w:rPr>
                 <w:rFonts w:ascii="Arial" w:eastAsia="Times New Roman" w:hAnsi="Arial" w:cs="Arial"/>
-                <w:i/>
-                <w:iCs/>
-                <w:color w:val="000000"/>
-                <w:sz w:val="20"/>
-                <w:lang w:eastAsia="zh-CN"/>
-              </w:rPr>
-              <w:t>Test case Title</w:t>
+                <w:color w:val="000000"/>
+                <w:sz w:val="20"/>
+                <w:lang w:eastAsia="zh-CN"/>
+              </w:rPr>
+              <w:t>Initializing the app and r</w:t>
+            </w:r>
+            <w:r>
+              <w:rPr>
+                <w:rFonts w:ascii="Arial" w:eastAsia="Times New Roman" w:hAnsi="Arial" w:cs="Arial"/>
+                <w:color w:val="000000"/>
+                <w:sz w:val="20"/>
+                <w:lang w:eastAsia="zh-CN"/>
+              </w:rPr>
+              <w:t xml:space="preserve">unning </w:t>
+            </w:r>
+            <w:proofErr w:type="spellStart"/>
+            <w:r>
+              <w:rPr>
+                <w:rFonts w:ascii="Arial" w:eastAsia="Times New Roman" w:hAnsi="Arial" w:cs="Arial"/>
+                <w:color w:val="000000"/>
+                <w:sz w:val="20"/>
+                <w:lang w:eastAsia="zh-CN"/>
+              </w:rPr>
+              <w:t>Streamlit</w:t>
+            </w:r>
+            <w:proofErr w:type="spellEnd"/>
+            <w:r>
+              <w:rPr>
+                <w:rFonts w:ascii="Arial" w:eastAsia="Times New Roman" w:hAnsi="Arial" w:cs="Arial"/>
+                <w:color w:val="000000"/>
+                <w:sz w:val="20"/>
+                <w:lang w:eastAsia="zh-CN"/>
+              </w:rPr>
+              <w:t xml:space="preserve"> with a simple chart</w:t>
             </w:r>
           </w:p>
         </w:tc>
@@ -1496,17 +1482,6 @@
                 <w:lang w:eastAsia="zh-CN"/>
               </w:rPr>
             </w:pPr>
-            <w:r>
-              <w:rPr>
-                <w:rFonts w:ascii="Arial" w:eastAsia="Times New Roman" w:hAnsi="Arial" w:cs="Arial"/>
-                <w:i/>
-                <w:iCs/>
-                <w:color w:val="000000"/>
-                <w:sz w:val="20"/>
-                <w:lang w:eastAsia="zh-CN"/>
-              </w:rPr>
-              <w:t>Lorem Ipsum…</w:t>
-            </w:r>
           </w:p>
         </w:tc>
       </w:tr>

</xml_diff>

<commit_message>
ensuring consistency in legends
</commit_message>
<xml_diff>
--- a/Project Documentation.docx
+++ b/Project Documentation.docx
@@ -163,7 +163,7 @@
             <w:szCs w:val="20"/>
             <w:lang w:eastAsia="zh-CN"/>
           </w:rPr>
-          <w:t>Analysing the Effectiveness of Waste Management</w:t>
+          <w:t>Municipal waste by waste management operations</w:t>
         </w:r>
       </w:hyperlink>
     </w:p>
@@ -218,6 +218,18 @@
         </w:rPr>
         <w:t>Link to Video presentation:</w:t>
       </w:r>
+      <w:r>
+        <w:rPr>
+          <w:rFonts w:ascii="Arial" w:eastAsia="Times New Roman" w:hAnsi="Arial" w:cs="Arial"/>
+          <w:b/>
+          <w:bCs/>
+          <w:color w:val="000000"/>
+          <w:sz w:val="20"/>
+          <w:szCs w:val="20"/>
+          <w:lang w:eastAsia="zh-CN"/>
+        </w:rPr>
+        <w:t xml:space="preserve"> </w:t>
+      </w:r>
     </w:p>
     <w:p>
       <w:pPr>
@@ -287,20 +299,48 @@
           <w:szCs w:val="20"/>
           <w:lang w:eastAsia="zh-CN"/>
         </w:rPr>
-        <w:tab/>
-      </w:r>
-      <w:r>
-        <w:rPr>
-          <w:rFonts w:ascii="Arial" w:eastAsia="Times New Roman" w:hAnsi="Arial" w:cs="Arial"/>
-          <w:b/>
-          <w:bCs/>
-          <w:color w:val="000000"/>
-          <w:sz w:val="20"/>
-          <w:szCs w:val="20"/>
-          <w:lang w:eastAsia="zh-CN"/>
-        </w:rPr>
-        <w:tab/>
-      </w:r>
+        <w:t xml:space="preserve"> </w:t>
+      </w:r>
+      <w:hyperlink r:id="rId7" w:history="1">
+        <w:r>
+          <w:rPr>
+            <w:rStyle w:val="Hyperlink"/>
+            <w:rFonts w:ascii="Arial" w:eastAsia="Times New Roman" w:hAnsi="Arial" w:cs="Arial"/>
+            <w:b/>
+            <w:bCs/>
+            <w:sz w:val="20"/>
+            <w:szCs w:val="20"/>
+            <w:lang w:eastAsia="zh-CN"/>
+          </w:rPr>
+          <w:t>waste-management-analysis-</w:t>
+        </w:r>
+        <w:proofErr w:type="spellStart"/>
+        <w:r>
+          <w:rPr>
+            <w:rStyle w:val="Hyperlink"/>
+            <w:rFonts w:ascii="Arial" w:eastAsia="Times New Roman" w:hAnsi="Arial" w:cs="Arial"/>
+            <w:b/>
+            <w:bCs/>
+            <w:sz w:val="20"/>
+            <w:szCs w:val="20"/>
+            <w:lang w:eastAsia="zh-CN"/>
+          </w:rPr>
+          <w:t>streamlit</w:t>
+        </w:r>
+        <w:proofErr w:type="spellEnd"/>
+        <w:r>
+          <w:rPr>
+            <w:rStyle w:val="Hyperlink"/>
+            <w:rFonts w:ascii="Arial" w:eastAsia="Times New Roman" w:hAnsi="Arial" w:cs="Arial"/>
+            <w:b/>
+            <w:bCs/>
+            <w:sz w:val="20"/>
+            <w:szCs w:val="20"/>
+            <w:lang w:eastAsia="zh-CN"/>
+          </w:rPr>
+          <w:t>-app</w:t>
+        </w:r>
+      </w:hyperlink>
     </w:p>
     <w:p>
       <w:pPr>
@@ -334,6 +374,32 @@
         </w:rPr>
         <w:t>Link to GitHub repository:</w:t>
       </w:r>
+      <w:r>
+        <w:rPr>
+          <w:rFonts w:ascii="Arial" w:eastAsia="Times New Roman" w:hAnsi="Arial" w:cs="Arial"/>
+          <w:b/>
+          <w:bCs/>
+          <w:color w:val="000000"/>
+          <w:sz w:val="20"/>
+          <w:szCs w:val="20"/>
+          <w:lang w:eastAsia="zh-CN"/>
+        </w:rPr>
+        <w:t xml:space="preserve"> </w:t>
+      </w:r>
+      <w:hyperlink r:id="rId8" w:history="1">
+        <w:r>
+          <w:rPr>
+            <w:rStyle w:val="Hyperlink"/>
+            <w:rFonts w:ascii="Arial" w:eastAsia="Times New Roman" w:hAnsi="Arial" w:cs="Arial"/>
+            <w:b/>
+            <w:bCs/>
+            <w:sz w:val="20"/>
+            <w:szCs w:val="20"/>
+            <w:lang w:eastAsia="zh-CN"/>
+          </w:rPr>
+          <w:t>EU-Waste-Management-GitHub-repo</w:t>
+        </w:r>
+      </w:hyperlink>
       <w:r>
         <w:rPr>
           <w:rFonts w:ascii="Arial" w:eastAsia="Times New Roman" w:hAnsi="Arial" w:cs="Arial"/>

</xml_diff>